<commit_message>
Formatting chosen after a word's last letter is for the typing that follows, as in Word, and the authored corpus document's bold, italic and underlined words finally carry what its script meant
Co-Authored-By: Claude Fable 5.1 <noreply@anthropic.com>
</commit_message>
<xml_diff>
--- a/corpus/docx/scriva-authored.docx
+++ b/corpus/docx/scriva-authored.docx
@@ -21,39 +21,35 @@
     <w:p>
       <w:pPr>
         <w:pStyle w:val="Normal"/>
+      </w:pPr>
+      <w:r>
+        <w:t xml:space="preserve">Some </w:t>
+      </w:r>
+      <w:r>
+        <w:rPr>
+          <w:b/>
+        </w:rPr>
+        <w:t>bold</w:t>
+      </w:r>
+      <w:r>
+        <w:rPr>
+          <w:b w:val="0"/>
+        </w:rPr>
+        <w:t xml:space="preserve">, some </w:t>
+      </w:r>
+      <w:r>
+        <w:rPr>
+          <w:b w:val="0"/>
+          <w:i/>
+        </w:rPr>
+        <w:t>italic</w:t>
+      </w:r>
+      <w:r>
         <w:rPr>
           <w:b w:val="0"/>
           <w:i w:val="0"/>
         </w:rPr>
-      </w:pPr>
-      <w:r>
-        <w:t>Some</w:t>
-      </w:r>
-      <w:r>
-        <w:rPr>
-          <w:b/>
-        </w:rPr>
-        <w:t xml:space="preserve"> </w:t>
-      </w:r>
-      <w:r>
-        <w:rPr>
-          <w:b w:val="0"/>
-        </w:rPr>
-        <w:t>bold, some</w:t>
-      </w:r>
-      <w:r>
-        <w:rPr>
-          <w:b w:val="0"/>
-          <w:i/>
-        </w:rPr>
-        <w:t xml:space="preserve"> </w:t>
-      </w:r>
-      <w:r>
-        <w:rPr>
-          <w:b w:val="0"/>
-          <w:i w:val="0"/>
-        </w:rPr>
-        <w:t>italic and some</w:t>
+        <w:t xml:space="preserve"> and some </w:t>
       </w:r>
       <w:r>
         <w:rPr>
@@ -61,14 +57,14 @@
           <w:i w:val="0"/>
           <w:u w:val="single"/>
         </w:rPr>
-        <w:t xml:space="preserve"> </w:t>
+        <w:t>underlined</w:t>
       </w:r>
       <w:r>
         <w:rPr>
           <w:b w:val="0"/>
           <w:i w:val="0"/>
         </w:rPr>
-        <w:t>underlined words share this paragraph, so that a run boundary falls inside a line.</w:t>
+        <w:t xml:space="preserve"> words share this paragraph, so that a run boundary falls inside a line.</w:t>
       </w:r>
     </w:p>
     <w:p>
@@ -78,16 +74,8 @@
           <w:ilvl w:val="0"/>
           <w:numId w:val="1"/>
         </w:numPr>
-        <w:rPr>
-          <w:b w:val="0"/>
-          <w:i w:val="0"/>
-        </w:rPr>
-      </w:pPr>
-      <w:r>
-        <w:rPr>
-          <w:b w:val="0"/>
-          <w:i w:val="0"/>
-        </w:rPr>
+      </w:pPr>
+      <w:r>
         <w:t>The first item of a bulleted list.</w:t>
       </w:r>
     </w:p>
@@ -98,32 +86,16 @@
           <w:ilvl w:val="0"/>
           <w:numId w:val="1"/>
         </w:numPr>
-        <w:rPr>
-          <w:b w:val="0"/>
-          <w:i w:val="0"/>
-        </w:rPr>
-      </w:pPr>
-      <w:r>
-        <w:rPr>
-          <w:b w:val="0"/>
-          <w:i w:val="0"/>
-        </w:rPr>
+      </w:pPr>
+      <w:r>
         <w:t>The second, which is long enough to wrap onto a second line at the width a new document has, so that the hanging indent is measured too.</w:t>
       </w:r>
     </w:p>
     <w:p>
       <w:pPr>
         <w:pStyle w:val="Normal"/>
-        <w:rPr>
-          <w:b w:val="0"/>
-          <w:i w:val="0"/>
-        </w:rPr>
-      </w:pPr>
-      <w:r>
-        <w:rPr>
-          <w:b w:val="0"/>
-          <w:i w:val="0"/>
-        </w:rPr>
+      </w:pPr>
+      <w:r>
         <w:t>A table of two rows and three columns, inserted as the dialog inserts one:</w:t>
       </w:r>
     </w:p>
@@ -211,16 +183,8 @@
     <w:p>
       <w:pPr>
         <w:pStyle w:val="Normal"/>
-        <w:rPr>
-          <w:b w:val="0"/>
-          <w:i w:val="0"/>
-        </w:rPr>
-      </w:pPr>
-      <w:r>
-        <w:rPr>
-          <w:b w:val="0"/>
-          <w:i w:val="0"/>
-        </w:rPr>
+      </w:pPr>
+      <w:r>
         <w:t>After the table, this line ends the first page.</w:t>
         <w:br w:type="page"/>
       </w:r>
@@ -229,16 +193,8 @@
       <w:pPr>
         <w:pStyle w:val="Normal"/>
         <w:jc w:val="center"/>
-        <w:rPr>
-          <w:b w:val="0"/>
-          <w:i w:val="0"/>
-        </w:rPr>
-      </w:pPr>
-      <w:r>
-        <w:rPr>
-          <w:b w:val="0"/>
-          <w:i w:val="0"/>
-        </w:rPr>
+      </w:pPr>
+      <w:r>
         <w:t>The second page begins with a centred line.</w:t>
       </w:r>
     </w:p>
@@ -250,16 +206,8 @@
           <w:numId w:val="2"/>
         </w:numPr>
         <w:jc w:val="left"/>
-        <w:rPr>
-          <w:b w:val="0"/>
-          <w:i w:val="0"/>
-        </w:rPr>
-      </w:pPr>
-      <w:r>
-        <w:rPr>
-          <w:b w:val="0"/>
-          <w:i w:val="0"/>
-        </w:rPr>
+      </w:pPr>
+      <w:r>
         <w:t>One.</w:t>
       </w:r>
     </w:p>
@@ -271,16 +219,8 @@
           <w:numId w:val="2"/>
         </w:numPr>
         <w:jc w:val="left"/>
-        <w:rPr>
-          <w:b w:val="0"/>
-          <w:i w:val="0"/>
-        </w:rPr>
-      </w:pPr>
-      <w:r>
-        <w:rPr>
-          <w:b w:val="0"/>
-          <w:i w:val="0"/>
-        </w:rPr>
+      </w:pPr>
+      <w:r>
         <w:t>Two.</w:t>
       </w:r>
     </w:p>
@@ -292,16 +232,8 @@
           <w:numId w:val="2"/>
         </w:numPr>
         <w:jc w:val="left"/>
-        <w:rPr>
-          <w:b w:val="0"/>
-          <w:i w:val="0"/>
-        </w:rPr>
-      </w:pPr>
-      <w:r>
-        <w:rPr>
-          <w:b w:val="0"/>
-          <w:i w:val="0"/>
-        </w:rPr>
+      </w:pPr>
+      <w:r>
         <w:t>Three.</w:t>
       </w:r>
     </w:p>
@@ -309,16 +241,8 @@
       <w:pPr>
         <w:pStyle w:val="Normal"/>
         <w:jc w:val="both"/>
-        <w:rPr>
-          <w:b w:val="0"/>
-          <w:i w:val="0"/>
-        </w:rPr>
-      </w:pPr>
-      <w:r>
-        <w:rPr>
-          <w:b w:val="0"/>
-          <w:i w:val="0"/>
-        </w:rPr>
+      </w:pPr>
+      <w:r>
         <w:t>The last paragraph, justified, is long enough to be set on more than one line so that the justification has something to spread: it goes on until it wraps, and a little further than that.</w:t>
       </w:r>
     </w:p>

</xml_diff>